<commit_message>
Add privacy consent PDF generation & downloads
Generate and serve per-lead privacy-consent PDFs: add LeadPrivacyConsentPdfService (mPDF) to render a template snapshot and store it in local storage when a lead accepts privacy consent. Persist snapshot metadata on Lead, build a user-friendly download filename, and expose download URLs in the Filament admin UI. Add a controller for private consent downloads (with permission checks) and adjust generic document download to use the stored download name. Ensure snapshot is removed on creation failure and add mpdf to composer.json; include the PDF template and related public assets. Tests and view/composable updates included to cover the new behavior.
</commit_message>
<xml_diff>
--- a/public/documents/legal/lead-personal-data-consent-v1.docx
+++ b/public/documents/legal/lead-personal-data-consent-v1.docx
@@ -9,70 +9,74 @@
           <w:rFonts w:ascii="Garamond" w:hAnsi="Garamond"/>
         </w:rPr>
       </w:pPr>
+      <w:r>
+        <w:rPr>
+          <w:rFonts w:ascii="Garamond" w:hAnsi="Garamond"/>
+          <w:b/>
+          <w:bCs/>
+        </w:rPr>
+        <w:t>ДЕКЛАРАЦИЯ-СЪГЛАСИЕ ЗА ОБРАБОТВАНЕ НА ЛИЧНИ ДАННИ</w:t>
+      </w:r>
+    </w:p>
+    <w:p>
+      <w:pPr>
+        <w:jc w:val="both"/>
+        <w:rPr>
+          <w:rFonts w:ascii="Garamond" w:hAnsi="Garamond"/>
+        </w:rPr>
+      </w:pPr>
+      <w:r>
+        <w:rPr>
+          <w:rFonts w:ascii="Garamond" w:hAnsi="Garamond"/>
+          <w:b/>
+          <w:bCs/>
+        </w:rPr>
+        <w:t>С поставянето на отметка в полет</w:t>
+      </w:r>
+      <w:r>
+        <w:rPr>
+          <w:rFonts w:ascii="Garamond" w:hAnsi="Garamond"/>
+          <w:b/>
+          <w:bCs/>
+        </w:rPr>
+        <w:t>о „Съгласен съм“ в уебсайт creditzona.bg</w:t>
+      </w:r>
+      <w:r>
+        <w:rPr>
+          <w:rFonts w:ascii="Garamond" w:hAnsi="Garamond"/>
+          <w:b/>
+          <w:bCs/>
+        </w:rPr>
+        <w:t>, Вие, в качеството си на субект на данни, декларирате, че сте информиран/а и давате своето свободно, конкретно и недвусмислено съгласие Администраторът да обработва личните Ви данни съгласно условията, посочени по-долу.</w:t>
+      </w:r>
+    </w:p>
+    <w:p>
+      <w:pPr>
+        <w:jc w:val="both"/>
+        <w:rPr>
+          <w:rFonts w:ascii="Garamond" w:hAnsi="Garamond"/>
+          <w:color w:val="FF0000"/>
+        </w:rPr>
+      </w:pPr>
+      <w:r>
+        <w:rPr>
+          <w:rFonts w:ascii="Garamond" w:hAnsi="Garamond"/>
+        </w:rPr>
+        <w:t xml:space="preserve">Долуподписаният/ата, </w:t>
+      </w:r>
+      <w:r>
+        <w:rPr>
+          <w:rFonts w:ascii="Garamond" w:hAnsi="Garamond"/>
+          <w:color w:val="FF0000"/>
+        </w:rPr>
+        <w:t>данни взети от първоначалното запитване на клиент,</w:t>
+      </w:r>
       <w:bookmarkStart w:id="0" w:name="_GoBack"/>
-      <w:r>
-        <w:rPr>
-          <w:rFonts w:ascii="Garamond" w:hAnsi="Garamond"/>
-          <w:b/>
-          <w:bCs/>
-        </w:rPr>
-        <w:t>ДЕКЛАРАЦИЯ-СЪГЛАСИЕ ЗА ОБРАБОТВАНЕ НА ЛИЧНИ ДАННИ</w:t>
-      </w:r>
-    </w:p>
-    <w:p>
-      <w:pPr>
-        <w:rPr>
-          <w:rFonts w:ascii="Garamond" w:hAnsi="Garamond"/>
-        </w:rPr>
-      </w:pPr>
-      <w:r>
-        <w:rPr>
-          <w:rFonts w:ascii="Garamond" w:hAnsi="Garamond"/>
-          <w:b/>
-          <w:bCs/>
-        </w:rPr>
-        <w:t>С поставянето на отметка в полет</w:t>
-      </w:r>
-      <w:r>
-        <w:rPr>
-          <w:rFonts w:ascii="Garamond" w:hAnsi="Garamond"/>
-          <w:b/>
-          <w:bCs/>
-        </w:rPr>
-        <w:t>о „Съгласен съм“ в уебсайт creditzona.bg</w:t>
-      </w:r>
-      <w:r>
-        <w:rPr>
-          <w:rFonts w:ascii="Garamond" w:hAnsi="Garamond"/>
-          <w:b/>
-          <w:bCs/>
-        </w:rPr>
-        <w:t>, Вие, в качеството си на субект на данни, декларирате, че сте информиран/а и давате своето свободно, конкретно и недвусмислено съгласие Администраторът да обработва личните Ви данни съгласно условията, посочени по-долу.</w:t>
-      </w:r>
-    </w:p>
-    <w:p>
-      <w:pPr>
-        <w:rPr>
-          <w:rFonts w:ascii="Garamond" w:hAnsi="Garamond"/>
-          <w:color w:val="FF0000"/>
-        </w:rPr>
-      </w:pPr>
-      <w:r>
-        <w:rPr>
-          <w:rFonts w:ascii="Garamond" w:hAnsi="Garamond"/>
-        </w:rPr>
-        <w:t xml:space="preserve">Долуподписаният/ата, </w:t>
-      </w:r>
-      <w:r>
-        <w:rPr>
-          <w:rFonts w:ascii="Garamond" w:hAnsi="Garamond"/>
-          <w:color w:val="FF0000"/>
-        </w:rPr>
-        <w:t>данни взети от първоначалното запитване на клиент,</w:t>
-      </w:r>
-    </w:p>
-    <w:p>
-      <w:pPr>
+      <w:bookmarkEnd w:id="0"/>
+    </w:p>
+    <w:p>
+      <w:pPr>
+        <w:jc w:val="both"/>
         <w:rPr>
           <w:rFonts w:ascii="Garamond" w:hAnsi="Garamond"/>
         </w:rPr>
@@ -106,6 +110,7 @@
     </w:p>
     <w:p>
       <w:pPr>
+        <w:jc w:val="both"/>
         <w:rPr>
           <w:rFonts w:ascii="Garamond" w:hAnsi="Garamond"/>
         </w:rPr>
@@ -127,22 +132,86 @@
           <w:rFonts w:ascii="Garamond" w:hAnsi="Garamond"/>
           <w:b/>
           <w:bCs/>
-          <w:highlight w:val="yellow"/>
-        </w:rPr>
-        <w:t>„________________________ ЕООД</w:t>
-      </w:r>
-      <w:r>
-        <w:rPr>
-          <w:rFonts w:ascii="Garamond" w:hAnsi="Garamond"/>
-          <w:highlight w:val="yellow"/>
-        </w:rPr>
-        <w:t>, ЕИК _______________, със седалище и адрес на управление: ____________________________________, тел.: _______________, имейл: _______________</w:t>
-      </w:r>
-      <w:r>
-        <w:rPr>
-          <w:rFonts w:ascii="Garamond" w:hAnsi="Garamond"/>
-        </w:rPr>
-        <w:t xml:space="preserve"> (наричано по-долу </w:t>
+        </w:rPr>
+        <w:t>"</w:t>
+      </w:r>
+      <w:proofErr w:type="spellStart"/>
+      <w:r>
+        <w:rPr>
+          <w:rFonts w:ascii="Garamond" w:hAnsi="Garamond"/>
+          <w:b/>
+          <w:bCs/>
+        </w:rPr>
+        <w:t>РеКредо</w:t>
+      </w:r>
+      <w:proofErr w:type="spellEnd"/>
+      <w:r>
+        <w:rPr>
+          <w:rFonts w:ascii="Garamond" w:hAnsi="Garamond"/>
+          <w:b/>
+          <w:bCs/>
+        </w:rPr>
+        <w:t xml:space="preserve"> Консулт" ДПК с ЕИК 208669746, със седалище и адрес на управление в гр. Пловдив, р-н Северен, ул. "Полковник Сава </w:t>
+      </w:r>
+      <w:proofErr w:type="spellStart"/>
+      <w:r>
+        <w:rPr>
+          <w:rFonts w:ascii="Garamond" w:hAnsi="Garamond"/>
+          <w:b/>
+          <w:bCs/>
+        </w:rPr>
+        <w:t>Муткуров</w:t>
+      </w:r>
+      <w:proofErr w:type="spellEnd"/>
+      <w:r>
+        <w:rPr>
+          <w:rFonts w:ascii="Garamond" w:hAnsi="Garamond"/>
+          <w:b/>
+          <w:bCs/>
+        </w:rPr>
+        <w:t xml:space="preserve">" № 30, </w:t>
+      </w:r>
+      <w:proofErr w:type="spellStart"/>
+      <w:r>
+        <w:rPr>
+          <w:rFonts w:ascii="Garamond" w:hAnsi="Garamond"/>
+          <w:b/>
+          <w:bCs/>
+        </w:rPr>
+        <w:t>ет</w:t>
+      </w:r>
+      <w:proofErr w:type="spellEnd"/>
+      <w:r>
+        <w:rPr>
+          <w:rFonts w:ascii="Garamond" w:hAnsi="Garamond"/>
+          <w:b/>
+          <w:bCs/>
+        </w:rPr>
+        <w:t xml:space="preserve"> 1, </w:t>
+      </w:r>
+      <w:proofErr w:type="spellStart"/>
+      <w:r>
+        <w:rPr>
+          <w:rFonts w:ascii="Garamond" w:hAnsi="Garamond"/>
+          <w:b/>
+          <w:bCs/>
+        </w:rPr>
+        <w:t>оф</w:t>
+      </w:r>
+      <w:proofErr w:type="spellEnd"/>
+      <w:r>
+        <w:rPr>
+          <w:rFonts w:ascii="Garamond" w:hAnsi="Garamond"/>
+          <w:b/>
+          <w:bCs/>
+        </w:rPr>
+        <w:t xml:space="preserve">. 2 </w:t>
+      </w:r>
+      <w:r>
+        <w:rPr>
+          <w:rFonts w:ascii="Garamond" w:hAnsi="Garamond"/>
+        </w:rPr>
+        <w:t>(наричано по-долу </w:t>
       </w:r>
       <w:r>
         <w:rPr>
@@ -161,6 +230,7 @@
     </w:p>
     <w:p>
       <w:pPr>
+        <w:jc w:val="both"/>
         <w:rPr>
           <w:rFonts w:ascii="Garamond" w:hAnsi="Garamond"/>
         </w:rPr>
@@ -176,6 +246,7 @@
     </w:p>
     <w:p>
       <w:pPr>
+        <w:jc w:val="both"/>
         <w:rPr>
           <w:rFonts w:ascii="Garamond" w:hAnsi="Garamond"/>
         </w:rPr>
@@ -197,6 +268,7 @@
     </w:p>
     <w:p>
       <w:pPr>
+        <w:jc w:val="both"/>
         <w:rPr>
           <w:rFonts w:ascii="Garamond" w:hAnsi="Garamond"/>
         </w:rPr>
@@ -216,6 +288,7 @@
           <w:ilvl w:val="0"/>
           <w:numId w:val="4"/>
         </w:numPr>
+        <w:jc w:val="both"/>
         <w:rPr>
           <w:rFonts w:ascii="Garamond" w:hAnsi="Garamond"/>
         </w:rPr>
@@ -241,6 +314,7 @@
           <w:ilvl w:val="0"/>
           <w:numId w:val="4"/>
         </w:numPr>
+        <w:jc w:val="both"/>
         <w:rPr>
           <w:rFonts w:ascii="Garamond" w:hAnsi="Garamond"/>
         </w:rPr>
@@ -266,6 +340,7 @@
           <w:ilvl w:val="0"/>
           <w:numId w:val="4"/>
         </w:numPr>
+        <w:jc w:val="both"/>
         <w:rPr>
           <w:rFonts w:ascii="Garamond" w:hAnsi="Garamond"/>
         </w:rPr>
@@ -291,6 +366,7 @@
           <w:ilvl w:val="0"/>
           <w:numId w:val="4"/>
         </w:numPr>
+        <w:jc w:val="both"/>
         <w:rPr>
           <w:rFonts w:ascii="Garamond" w:hAnsi="Garamond"/>
         </w:rPr>
@@ -312,6 +388,7 @@
     </w:p>
     <w:p>
       <w:pPr>
+        <w:jc w:val="both"/>
         <w:rPr>
           <w:rFonts w:ascii="Garamond" w:hAnsi="Garamond"/>
         </w:rPr>
@@ -384,6 +461,7 @@
           </w:tcPr>
           <w:p>
             <w:pPr>
+              <w:jc w:val="both"/>
               <w:rPr>
                 <w:rFonts w:ascii="Garamond" w:hAnsi="Garamond"/>
               </w:rPr>
@@ -410,6 +488,7 @@
           </w:tcPr>
           <w:p>
             <w:pPr>
+              <w:jc w:val="both"/>
               <w:rPr>
                 <w:rFonts w:ascii="Garamond" w:hAnsi="Garamond"/>
                 <w:b/>
@@ -448,6 +527,7 @@
           </w:tcPr>
           <w:p>
             <w:pPr>
+              <w:jc w:val="both"/>
               <w:rPr>
                 <w:rFonts w:ascii="Garamond" w:hAnsi="Garamond"/>
                 <w:b/>
@@ -476,6 +556,7 @@
           </w:tcPr>
           <w:p>
             <w:pPr>
+              <w:jc w:val="both"/>
               <w:rPr>
                 <w:rFonts w:ascii="Garamond" w:hAnsi="Garamond"/>
               </w:rPr>
@@ -510,6 +591,7 @@
           </w:tcPr>
           <w:p>
             <w:pPr>
+              <w:jc w:val="both"/>
               <w:rPr>
                 <w:rFonts w:ascii="Garamond" w:hAnsi="Garamond"/>
               </w:rPr>
@@ -536,6 +618,7 @@
           </w:tcPr>
           <w:p>
             <w:pPr>
+              <w:jc w:val="both"/>
               <w:rPr>
                 <w:rFonts w:ascii="Garamond" w:hAnsi="Garamond"/>
               </w:rPr>
@@ -570,6 +653,7 @@
           </w:tcPr>
           <w:p>
             <w:pPr>
+              <w:jc w:val="both"/>
               <w:rPr>
                 <w:rFonts w:ascii="Garamond" w:hAnsi="Garamond"/>
               </w:rPr>
@@ -596,6 +680,7 @@
           </w:tcPr>
           <w:p>
             <w:pPr>
+              <w:jc w:val="both"/>
               <w:rPr>
                 <w:rFonts w:ascii="Garamond" w:hAnsi="Garamond"/>
               </w:rPr>
@@ -612,6 +697,7 @@
     </w:tbl>
     <w:p>
       <w:pPr>
+        <w:jc w:val="both"/>
         <w:rPr>
           <w:rFonts w:ascii="Garamond" w:hAnsi="Garamond"/>
         </w:rPr>
@@ -631,6 +717,7 @@
           <w:ilvl w:val="0"/>
           <w:numId w:val="5"/>
         </w:numPr>
+        <w:jc w:val="both"/>
         <w:rPr>
           <w:rFonts w:ascii="Garamond" w:hAnsi="Garamond"/>
         </w:rPr>
@@ -648,6 +735,7 @@
           <w:ilvl w:val="0"/>
           <w:numId w:val="5"/>
         </w:numPr>
+        <w:jc w:val="both"/>
         <w:rPr>
           <w:rFonts w:ascii="Garamond" w:hAnsi="Garamond"/>
         </w:rPr>
@@ -665,6 +753,7 @@
           <w:ilvl w:val="0"/>
           <w:numId w:val="5"/>
         </w:numPr>
+        <w:jc w:val="both"/>
         <w:rPr>
           <w:rFonts w:ascii="Garamond" w:hAnsi="Garamond"/>
         </w:rPr>
@@ -679,6 +768,7 @@
     </w:p>
     <w:p>
       <w:pPr>
+        <w:jc w:val="both"/>
         <w:rPr>
           <w:rFonts w:ascii="Garamond" w:hAnsi="Garamond"/>
         </w:rPr>
@@ -700,6 +790,7 @@
     </w:p>
     <w:p>
       <w:pPr>
+        <w:jc w:val="both"/>
         <w:rPr>
           <w:rFonts w:ascii="Garamond" w:hAnsi="Garamond"/>
         </w:rPr>
@@ -719,6 +810,7 @@
           <w:ilvl w:val="0"/>
           <w:numId w:val="6"/>
         </w:numPr>
+        <w:jc w:val="both"/>
         <w:rPr>
           <w:rFonts w:ascii="Garamond" w:hAnsi="Garamond"/>
         </w:rPr>
@@ -744,6 +836,7 @@
           <w:ilvl w:val="0"/>
           <w:numId w:val="6"/>
         </w:numPr>
+        <w:jc w:val="both"/>
         <w:rPr>
           <w:rFonts w:ascii="Garamond" w:hAnsi="Garamond"/>
         </w:rPr>
@@ -769,6 +862,7 @@
           <w:ilvl w:val="0"/>
           <w:numId w:val="6"/>
         </w:numPr>
+        <w:jc w:val="both"/>
         <w:rPr>
           <w:rFonts w:ascii="Garamond" w:hAnsi="Garamond"/>
         </w:rPr>
@@ -794,6 +888,7 @@
           <w:ilvl w:val="0"/>
           <w:numId w:val="6"/>
         </w:numPr>
+        <w:jc w:val="both"/>
         <w:rPr>
           <w:rFonts w:ascii="Garamond" w:hAnsi="Garamond"/>
         </w:rPr>
@@ -813,6 +908,7 @@
           <w:ilvl w:val="0"/>
           <w:numId w:val="6"/>
         </w:numPr>
+        <w:jc w:val="both"/>
         <w:rPr>
           <w:rFonts w:ascii="Garamond" w:hAnsi="Garamond"/>
         </w:rPr>
@@ -832,6 +928,7 @@
           <w:ilvl w:val="0"/>
           <w:numId w:val="6"/>
         </w:numPr>
+        <w:jc w:val="both"/>
         <w:rPr>
           <w:rFonts w:ascii="Garamond" w:hAnsi="Garamond"/>
         </w:rPr>
@@ -857,6 +954,7 @@
           <w:ilvl w:val="0"/>
           <w:numId w:val="6"/>
         </w:numPr>
+        <w:jc w:val="both"/>
         <w:rPr>
           <w:rFonts w:ascii="Garamond" w:hAnsi="Garamond"/>
         </w:rPr>
@@ -882,6 +980,7 @@
           <w:ilvl w:val="0"/>
           <w:numId w:val="6"/>
         </w:numPr>
+        <w:jc w:val="both"/>
         <w:rPr>
           <w:rFonts w:ascii="Garamond" w:hAnsi="Garamond"/>
         </w:rPr>
@@ -903,6 +1002,7 @@
     </w:p>
     <w:p>
       <w:pPr>
+        <w:jc w:val="both"/>
         <w:rPr>
           <w:rFonts w:ascii="Garamond" w:hAnsi="Garamond"/>
         </w:rPr>
@@ -924,6 +1024,7 @@
     </w:p>
     <w:p>
       <w:pPr>
+        <w:jc w:val="both"/>
         <w:rPr>
           <w:rFonts w:ascii="Garamond" w:hAnsi="Garamond"/>
         </w:rPr>
@@ -935,7 +1036,6 @@
         <w:t>** Съгласен съм**</w:t>
       </w:r>
     </w:p>
-    <w:bookmarkEnd w:id="0"/>
     <w:p/>
     <w:sectPr>
       <w:pgSz w:w="11906" w:h="16838"/>
@@ -2261,6 +2361,7 @@
   <w:style w:type="character" w:default="1" w:styleId="a0">
     <w:name w:val="Default Paragraph Font"/>
     <w:uiPriority w:val="1"/>
+    <w:semiHidden/>
     <w:unhideWhenUsed/>
   </w:style>
   <w:style w:type="table" w:default="1" w:styleId="a1">

</xml_diff>